<commit_message>
docs(career): CVs reflect closed Neo4j gap (live-verified) + LangGraph; role-1 cover note updated
</commit_message>
<xml_diff>
--- a/docs/career/cv-ai-contract-1page.docx
+++ b/docs/career/cv-ai-contract-1page.docx
@@ -69,7 +69,7 @@
         <w:rPr>
           <w:b w:val="0"/>
         </w:rPr>
-        <w:t>RAG (hybrid retrieval, reranking, groundedness) · Agents &amp; tool-use · LLM evaluations (golden sets, LLM-as-judge, RAGAS, CI gates) · Python (async, typing, pytest, FastAPI, Pydantic v2) · Google Cloud (Cloud Run, GKE, BigQuery, Vertex AI, Workload Identity Federation) · AWS (EKS) · Azure OpenAI · Terraform · Docker · Kubernetes/Helm · CI/CD · PostgreSQL + pgvector</w:t>
+        <w:t>RAG (hybrid retrieval, reranking, groundedness) · Knowledge Graphs (Neo4j/Cypher — verified live) · Agents &amp; tool-use (incl. LangGraph) · LLM evaluations (golden sets, LLM-as-judge, RAGAS, CI gates) · Python (async, typing, pytest, FastAPI, Pydantic v2) · Google Cloud (Cloud Run, GKE, BigQuery, Vertex AI, Workload Identity Federation) · AWS (EKS) · Azure OpenAI · Terraform · Docker · Kubernetes/Helm · CI/CD · PostgreSQL + pgvector</w:t>
       </w:r>
     </w:p>
     <w:p>
@@ -100,7 +100,7 @@
         <w:rPr>
           <w:b w:val="0"/>
         </w:rPr>
-        <w:t xml:space="preserve"> — deterministic CPM engine + Scheduler / Risk / Optimiser agents; retry/backoff + circuit breaker + Pydantic-v2 validation; 19 tests, ≥80% coverage, golden-case evals. github.com/koatedevopskpai/multi-agent-optimizer</w:t>
+        <w:t xml:space="preserve"> — deterministic CPM engine + Scheduler / Risk / Optimiser agents; retry/backoff + circuit breaker + Pydantic-v2 validation; optional LangGraph StateGraph; 19 tests, ≥80% coverage, golden-case evals. github.com/koatedevopskpai/multi-agent-optimizer</w:t>
       </w:r>
     </w:p>
     <w:p>
@@ -118,7 +118,7 @@
         <w:rPr>
           <w:b w:val="0"/>
         </w:rPr>
-        <w:t xml:space="preserve"> — planner-executor RAG with hybrid retrieval (BM25 + dense), Reciprocal Rank Fusion and a groundedness filter; 97% coverage + retrieval eval gate. github.com/koatedevopskpai/agentic-rag-hybrid</w:t>
+        <w:t xml:space="preserve"> — planner-executor RAG with hybrid retrieval (BM25 + dense), Reciprocal Rank Fusion and a groundedness filter; GraphRAG layer verified 3/3 exact match against live Neo4j; 97% coverage + retrieval eval gate. github.com/koatedevopskpai/agentic-rag-hybrid</w:t>
       </w:r>
     </w:p>
     <w:p>
@@ -176,6 +176,18 @@
           <w:b w:val="0"/>
         </w:rPr>
         <w:t>Ship production LLM systems (RAG, agents, evals) with deterministic-first design and CI evaluation gates.</w:t>
+      </w:r>
+    </w:p>
+    <w:p>
+      <w:pPr>
+        <w:pStyle w:val="ListBullet"/>
+        <w:spacing w:after="20"/>
+      </w:pPr>
+      <w:r>
+        <w:rPr>
+          <w:b w:val="0"/>
+        </w:rPr>
+        <w:t>Graph retrieval (Cypher/entity expansion) verified 3/3 exact match against live Neo4j.</w:t>
       </w:r>
     </w:p>
     <w:p>

</xml_diff>